<commit_message>
Ops close-out: password rotated+verified, restore tested, prod cleaned, RUNBOOK, TRD amendment A1, plan status
</commit_message>
<xml_diff>
--- a/ROE - TECHNICAL REQUIREMENTS DOCUMENT.docx
+++ b/ROE - TECHNICAL REQUIREMENTS DOCUMENT.docx
@@ -10382,6 +10382,39 @@
     <w:p>
       <w:r>
         <w:t>ROE — No one lost to silence.</w:t>
+      </w:r>
+    </w:p>
+    <w:p>
+      <w:pPr>
+        <w:pStyle w:val="Heading1"/>
+      </w:pPr>
+      <w:r>
+        <w:t>16. Amendment A1 — Hosting moved Vercel → Netlify (9 Oct 2026)</w:t>
+      </w:r>
+    </w:p>
+    <w:p>
+      <w:r>
+        <w:t>Production serves from Netlify (https://roe-pilot.netlify.app); the Vercel project is retained as fallback. TRD §2 hosting baseline (Vercel-first) is superseded for the pilot; all other stack choices stand.</w:t>
+      </w:r>
+    </w:p>
+    <w:p>
+      <w:r>
+        <w:t>Reason: Vercel Authentication SSO wall gated all routes including login with no working CLI/API path to relax it; Netlify serves the same Next.js build publicly with zero code changes (adapter handled Next 16 cleanly).</w:t>
+      </w:r>
+    </w:p>
+    <w:p>
+      <w:r>
+        <w:t>Auth model unchanged: Better Auth self-managed with Drizzle adapter; Neon managed Auth remains a future option, not adopted.</w:t>
+      </w:r>
+    </w:p>
+    <w:p>
+      <w:r>
+        <w:t>AI inference posture unchanged: local OmniRoute gateway + Ollama for development; Neon AI Gateway credentialed in-project as the hosted path. No user-facing AI until pilot gate passes.</w:t>
+      </w:r>
+    </w:p>
+    <w:p>
+      <w:r>
+        <w:t>Least-privilege app traffic (non-owner DB role) remains post-pilot work; RLS + owner-connection + app authorisation carry the pilot.</w:t>
       </w:r>
     </w:p>
     <w:sectPr>

</xml_diff>